<commit_message>
fix bug queue form jadwal
</commit_message>
<xml_diff>
--- a/public/doc/input/rehabmedik/cetakFormJadwalPelayanan.docx
+++ b/public/doc/input/rehabmedik/cetakFormJadwalPelayanan.docx
@@ -61,12 +61,30 @@
                 <w:lang w:val="en-US"/>
               </w:rPr>
             </w:pPr>
-            <w:r>
-              <w:rPr>
-                <w:rFonts w:ascii="Bookman Old Style" w:hAnsi="Bookman Old Style"/>
-                <w:lang w:val="en-US"/>
-              </w:rPr>
-              <w:t xml:space="preserve">Diagnosa : </w:t>
+            <w:proofErr w:type="spellStart"/>
+            <w:proofErr w:type="gramStart"/>
+            <w:r>
+              <w:rPr>
+                <w:rFonts w:ascii="Bookman Old Style" w:hAnsi="Bookman Old Style"/>
+                <w:lang w:val="en-US"/>
+              </w:rPr>
+              <w:t>Diagnosa</w:t>
+            </w:r>
+            <w:proofErr w:type="spellEnd"/>
+            <w:r>
+              <w:rPr>
+                <w:rFonts w:ascii="Bookman Old Style" w:hAnsi="Bookman Old Style"/>
+                <w:lang w:val="en-US"/>
+              </w:rPr>
+              <w:t xml:space="preserve"> :</w:t>
+            </w:r>
+            <w:proofErr w:type="gramEnd"/>
+            <w:r>
+              <w:rPr>
+                <w:rFonts w:ascii="Bookman Old Style" w:hAnsi="Bookman Old Style"/>
+                <w:lang w:val="en-US"/>
+              </w:rPr>
+              <w:t xml:space="preserve"> </w:t>
             </w:r>
           </w:p>
           <w:p>
@@ -83,25 +101,7 @@
                 <w:szCs w:val="20"/>
                 <w:lang w:val="en-US"/>
               </w:rPr>
-              <w:t>${</w:t>
-            </w:r>
-            <w:r>
-              <w:rPr>
-                <w:rFonts w:ascii="Bookman Old Style" w:hAnsi="Bookman Old Style"/>
-                <w:sz w:val="20"/>
-                <w:szCs w:val="20"/>
-                <w:lang w:val="en-US"/>
-              </w:rPr>
-              <w:t>DIAG_MEDIS</w:t>
-            </w:r>
-            <w:r>
-              <w:rPr>
-                <w:rFonts w:ascii="Bookman Old Style" w:hAnsi="Bookman Old Style"/>
-                <w:sz w:val="20"/>
-                <w:szCs w:val="20"/>
-                <w:lang w:val="en-US"/>
-              </w:rPr>
-              <w:t>}</w:t>
+              <w:t>${DIAG_MEDIS}</w:t>
             </w:r>
           </w:p>
         </w:tc>
@@ -186,8 +186,17 @@
                 <w:rFonts w:ascii="Bookman Old Style" w:hAnsi="Bookman Old Style"/>
                 <w:lang w:val="en-US"/>
               </w:rPr>
-              <w:t>Nama Pasien</w:t>
-            </w:r>
+              <w:t xml:space="preserve">Nama </w:t>
+            </w:r>
+            <w:proofErr w:type="spellStart"/>
+            <w:r>
+              <w:rPr>
+                <w:rFonts w:ascii="Bookman Old Style" w:hAnsi="Bookman Old Style"/>
+                <w:lang w:val="en-US"/>
+              </w:rPr>
+              <w:t>Pasien</w:t>
+            </w:r>
+            <w:proofErr w:type="spellEnd"/>
           </w:p>
         </w:tc>
         <w:tc>
@@ -246,12 +255,21 @@
                 <w:lang w:val="en-US"/>
               </w:rPr>
             </w:pPr>
-            <w:r>
-              <w:rPr>
-                <w:rFonts w:ascii="Bookman Old Style" w:hAnsi="Bookman Old Style"/>
-                <w:lang w:val="en-US"/>
-              </w:rPr>
-              <w:t>Tanggal Lahir</w:t>
+            <w:proofErr w:type="spellStart"/>
+            <w:r>
+              <w:rPr>
+                <w:rFonts w:ascii="Bookman Old Style" w:hAnsi="Bookman Old Style"/>
+                <w:lang w:val="en-US"/>
+              </w:rPr>
+              <w:t>Tanggal</w:t>
+            </w:r>
+            <w:proofErr w:type="spellEnd"/>
+            <w:r>
+              <w:rPr>
+                <w:rFonts w:ascii="Bookman Old Style" w:hAnsi="Bookman Old Style"/>
+                <w:lang w:val="en-US"/>
+              </w:rPr>
+              <w:t xml:space="preserve"> Lahir</w:t>
             </w:r>
           </w:p>
         </w:tc>
@@ -295,12 +313,46 @@
                 <w:lang w:val="en-US"/>
               </w:rPr>
             </w:pPr>
-            <w:r>
-              <w:rPr>
-                <w:rFonts w:ascii="Bookman Old Style" w:hAnsi="Bookman Old Style"/>
-                <w:lang w:val="en-US"/>
-              </w:rPr>
-              <w:t xml:space="preserve">Permintaan Terapi : </w:t>
+            <w:proofErr w:type="spellStart"/>
+            <w:r>
+              <w:rPr>
+                <w:rFonts w:ascii="Bookman Old Style" w:hAnsi="Bookman Old Style"/>
+                <w:lang w:val="en-US"/>
+              </w:rPr>
+              <w:t>Permintaan</w:t>
+            </w:r>
+            <w:proofErr w:type="spellEnd"/>
+            <w:r>
+              <w:rPr>
+                <w:rFonts w:ascii="Bookman Old Style" w:hAnsi="Bookman Old Style"/>
+                <w:lang w:val="en-US"/>
+              </w:rPr>
+              <w:t xml:space="preserve"> </w:t>
+            </w:r>
+            <w:proofErr w:type="spellStart"/>
+            <w:proofErr w:type="gramStart"/>
+            <w:r>
+              <w:rPr>
+                <w:rFonts w:ascii="Bookman Old Style" w:hAnsi="Bookman Old Style"/>
+                <w:lang w:val="en-US"/>
+              </w:rPr>
+              <w:t>Terapi</w:t>
+            </w:r>
+            <w:proofErr w:type="spellEnd"/>
+            <w:r>
+              <w:rPr>
+                <w:rFonts w:ascii="Bookman Old Style" w:hAnsi="Bookman Old Style"/>
+                <w:lang w:val="en-US"/>
+              </w:rPr>
+              <w:t xml:space="preserve"> :</w:t>
+            </w:r>
+            <w:proofErr w:type="gramEnd"/>
+            <w:r>
+              <w:rPr>
+                <w:rFonts w:ascii="Bookman Old Style" w:hAnsi="Bookman Old Style"/>
+                <w:lang w:val="en-US"/>
+              </w:rPr>
+              <w:t xml:space="preserve"> </w:t>
             </w:r>
           </w:p>
           <w:p>
@@ -320,25 +372,7 @@
                 <w:szCs w:val="20"/>
                 <w:lang w:val="en-US"/>
               </w:rPr>
-              <w:t>${</w:t>
-            </w:r>
-            <w:r>
-              <w:rPr>
-                <w:rFonts w:ascii="Bookman Old Style" w:hAnsi="Bookman Old Style"/>
-                <w:sz w:val="20"/>
-                <w:szCs w:val="20"/>
-                <w:lang w:val="en-US"/>
-              </w:rPr>
-              <w:t>PERMINTAAN_TERAPI</w:t>
-            </w:r>
-            <w:r>
-              <w:rPr>
-                <w:rFonts w:ascii="Bookman Old Style" w:hAnsi="Bookman Old Style"/>
-                <w:sz w:val="20"/>
-                <w:szCs w:val="20"/>
-                <w:lang w:val="en-US"/>
-              </w:rPr>
-              <w:t>}</w:t>
+              <w:t>${PERMINTAAN_TERAPI}</w:t>
             </w:r>
           </w:p>
         </w:tc>
@@ -445,6 +479,7 @@
                 <w:lang w:val="en-US"/>
               </w:rPr>
             </w:pPr>
+            <w:proofErr w:type="spellStart"/>
             <w:r>
               <w:rPr>
                 <w:rFonts w:ascii="Bookman Old Style" w:hAnsi="Bookman Old Style"/>
@@ -452,6 +487,7 @@
               </w:rPr>
               <w:t>Tanggal</w:t>
             </w:r>
+            <w:proofErr w:type="spellEnd"/>
           </w:p>
         </w:tc>
         <w:tc>
@@ -474,8 +510,17 @@
                 <w:rFonts w:ascii="Bookman Old Style" w:hAnsi="Bookman Old Style"/>
                 <w:lang w:val="en-US"/>
               </w:rPr>
-              <w:t>Tanda Tangan</w:t>
-            </w:r>
+              <w:t xml:space="preserve">Tanda </w:t>
+            </w:r>
+            <w:proofErr w:type="spellStart"/>
+            <w:r>
+              <w:rPr>
+                <w:rFonts w:ascii="Bookman Old Style" w:hAnsi="Bookman Old Style"/>
+                <w:lang w:val="en-US"/>
+              </w:rPr>
+              <w:t>Tangan</w:t>
+            </w:r>
+            <w:proofErr w:type="spellEnd"/>
           </w:p>
         </w:tc>
       </w:tr>
@@ -545,6 +590,7 @@
                 <w:lang w:val="en-US"/>
               </w:rPr>
             </w:pPr>
+            <w:proofErr w:type="spellStart"/>
             <w:r>
               <w:rPr>
                 <w:rFonts w:ascii="Bookman Old Style" w:hAnsi="Bookman Old Style"/>
@@ -552,6 +598,7 @@
               </w:rPr>
               <w:t>Pasien</w:t>
             </w:r>
+            <w:proofErr w:type="spellEnd"/>
           </w:p>
         </w:tc>
         <w:tc>
@@ -613,12 +660,21 @@
                 <w:lang w:val="en-US"/>
               </w:rPr>
             </w:pPr>
-            <w:r>
-              <w:rPr>
-                <w:rFonts w:ascii="Bookman Old Style" w:hAnsi="Bookman Old Style"/>
-                <w:lang w:val="en-US"/>
-              </w:rPr>
-              <w:t>Terapis 2</w:t>
+            <w:proofErr w:type="spellStart"/>
+            <w:r>
+              <w:rPr>
+                <w:rFonts w:ascii="Bookman Old Style" w:hAnsi="Bookman Old Style"/>
+                <w:lang w:val="en-US"/>
+              </w:rPr>
+              <w:t>Terapis</w:t>
+            </w:r>
+            <w:proofErr w:type="spellEnd"/>
+            <w:r>
+              <w:rPr>
+                <w:rFonts w:ascii="Bookman Old Style" w:hAnsi="Bookman Old Style"/>
+                <w:lang w:val="en-US"/>
+              </w:rPr>
+              <w:t xml:space="preserve"> 2</w:t>
             </w:r>
           </w:p>
         </w:tc>
@@ -714,7 +770,25 @@
                 <w:szCs w:val="20"/>
                 <w:lang w:val="en-US"/>
               </w:rPr>
-              <w:t>${TGL}</w:t>
+              <w:t>${</w:t>
+            </w:r>
+            <w:r>
+              <w:rPr>
+                <w:rFonts w:ascii="Bookman Old Style" w:hAnsi="Bookman Old Style"/>
+                <w:sz w:val="16"/>
+                <w:szCs w:val="16"/>
+                <w:lang w:val="en-US"/>
+              </w:rPr>
+              <w:t>TGL</w:t>
+            </w:r>
+            <w:r>
+              <w:rPr>
+                <w:rFonts w:ascii="Bookman Old Style" w:hAnsi="Bookman Old Style"/>
+                <w:sz w:val="20"/>
+                <w:szCs w:val="20"/>
+                <w:lang w:val="en-US"/>
+              </w:rPr>
+              <w:t>}</w:t>
             </w:r>
           </w:p>
         </w:tc>
@@ -770,21 +844,7 @@
                 <w:rFonts w:ascii="Bookman Old Style" w:hAnsi="Bookman Old Style"/>
                 <w:lang w:val="en-US"/>
               </w:rPr>
-              <w:t>${TTD_</w:t>
-            </w:r>
-            <w:r>
-              <w:rPr>
-                <w:rFonts w:ascii="Bookman Old Style" w:hAnsi="Bookman Old Style"/>
-                <w:lang w:val="en-US"/>
-              </w:rPr>
-              <w:t>DOKTER</w:t>
-            </w:r>
-            <w:r>
-              <w:rPr>
-                <w:rFonts w:ascii="Bookman Old Style" w:hAnsi="Bookman Old Style"/>
-                <w:lang w:val="en-US"/>
-              </w:rPr>
-              <w:t>}</w:t>
+              <w:t>${TTD_DOKTER}</w:t>
             </w:r>
           </w:p>
         </w:tc>
@@ -805,21 +865,7 @@
                 <w:rFonts w:ascii="Bookman Old Style" w:hAnsi="Bookman Old Style"/>
                 <w:lang w:val="en-US"/>
               </w:rPr>
-              <w:t>${TTD_</w:t>
-            </w:r>
-            <w:r>
-              <w:rPr>
-                <w:rFonts w:ascii="Bookman Old Style" w:hAnsi="Bookman Old Style"/>
-                <w:lang w:val="en-US"/>
-              </w:rPr>
-              <w:t>TERAPIS1</w:t>
-            </w:r>
-            <w:r>
-              <w:rPr>
-                <w:rFonts w:ascii="Bookman Old Style" w:hAnsi="Bookman Old Style"/>
-                <w:lang w:val="en-US"/>
-              </w:rPr>
-              <w:t>}</w:t>
+              <w:t>${TTD_TERAPIS1}</w:t>
             </w:r>
           </w:p>
         </w:tc>
@@ -840,21 +886,7 @@
                 <w:rFonts w:ascii="Bookman Old Style" w:hAnsi="Bookman Old Style"/>
                 <w:lang w:val="en-US"/>
               </w:rPr>
-              <w:t>${TTD_</w:t>
-            </w:r>
-            <w:r>
-              <w:rPr>
-                <w:rFonts w:ascii="Bookman Old Style" w:hAnsi="Bookman Old Style"/>
-                <w:lang w:val="en-US"/>
-              </w:rPr>
-              <w:t>TERAPIS2</w:t>
-            </w:r>
-            <w:r>
-              <w:rPr>
-                <w:rFonts w:ascii="Bookman Old Style" w:hAnsi="Bookman Old Style"/>
-                <w:lang w:val="en-US"/>
-              </w:rPr>
-              <w:t>}</w:t>
+              <w:t>${TTD_TERAPIS2}</w:t>
             </w:r>
           </w:p>
         </w:tc>
@@ -1542,12 +1574,21 @@
           <w:lang w:val="en-US"/>
         </w:rPr>
       </w:pPr>
+      <w:proofErr w:type="spellStart"/>
       <w:r>
         <w:rPr>
           <w:rFonts w:ascii="Bookman Old Style" w:hAnsi="Bookman Old Style"/>
           <w:lang w:val="en-US"/>
         </w:rPr>
-        <w:t>Sukoharjo, ${</w:t>
+        <w:t>Sukoharjo</w:t>
+      </w:r>
+      <w:proofErr w:type="spellEnd"/>
+      <w:r>
+        <w:rPr>
+          <w:rFonts w:ascii="Bookman Old Style" w:hAnsi="Bookman Old Style"/>
+          <w:lang w:val="en-US"/>
+        </w:rPr>
+        <w:t>, ${</w:t>
       </w:r>
       <w:r>
         <w:rPr>
@@ -1579,8 +1620,17 @@
           <w:rFonts w:ascii="Bookman Old Style" w:hAnsi="Bookman Old Style"/>
           <w:lang w:val="en-US"/>
         </w:rPr>
-        <w:t>Dokter Pemeriksa</w:t>
+        <w:t xml:space="preserve">Dokter </w:t>
       </w:r>
+      <w:proofErr w:type="spellStart"/>
+      <w:r>
+        <w:rPr>
+          <w:rFonts w:ascii="Bookman Old Style" w:hAnsi="Bookman Old Style"/>
+          <w:lang w:val="en-US"/>
+        </w:rPr>
+        <w:t>Pemeriksa</w:t>
+      </w:r>
+      <w:proofErr w:type="spellEnd"/>
     </w:p>
     <w:p>
       <w:pPr>
@@ -1924,6 +1974,7 @@
       </w:rPr>
       <w:t>Email. pku.sukoharjo@gmail.com | Website. www.</w:t>
     </w:r>
+    <w:proofErr w:type="spellStart"/>
     <w:r>
       <w:rPr>
         <w:rFonts w:ascii="Calibri Light" w:hAnsi="Calibri Light"/>
@@ -1935,6 +1986,7 @@
       </w:rPr>
       <w:t>rs</w:t>
     </w:r>
+    <w:proofErr w:type="spellEnd"/>
     <w:r>
       <w:rPr>
         <w:rFonts w:ascii="Calibri Light" w:hAnsi="Calibri Light"/>

</xml_diff>

<commit_message>
ttd form jpel smaller
</commit_message>
<xml_diff>
--- a/public/doc/input/rehabmedik/cetakFormJadwalPelayanan.docx
+++ b/public/doc/input/rehabmedik/cetakFormJadwalPelayanan.docx
@@ -1567,7 +1567,7 @@
     <w:p>
       <w:pPr>
         <w:spacing w:before="240" w:after="0" w:line="360" w:lineRule="auto"/>
-        <w:ind w:firstLine="5529"/>
+        <w:ind w:firstLine="5103"/>
         <w:jc w:val="center"/>
         <w:rPr>
           <w:rFonts w:ascii="Bookman Old Style" w:hAnsi="Bookman Old Style"/>
@@ -1608,7 +1608,7 @@
     <w:p>
       <w:pPr>
         <w:spacing w:after="0" w:line="360" w:lineRule="auto"/>
-        <w:ind w:firstLine="5954"/>
+        <w:ind w:firstLine="5103"/>
         <w:jc w:val="center"/>
         <w:rPr>
           <w:rFonts w:ascii="Bookman Old Style" w:hAnsi="Bookman Old Style"/>
@@ -1635,7 +1635,7 @@
     <w:p>
       <w:pPr>
         <w:spacing w:after="0" w:line="360" w:lineRule="auto"/>
-        <w:ind w:firstLine="5954"/>
+        <w:ind w:firstLine="5103"/>
         <w:jc w:val="center"/>
         <w:rPr>
           <w:rFonts w:ascii="Bookman Old Style" w:hAnsi="Bookman Old Style"/>
@@ -1674,16 +1674,20 @@
     <w:p>
       <w:pPr>
         <w:spacing w:after="0" w:line="360" w:lineRule="auto"/>
-        <w:ind w:firstLine="5954"/>
+        <w:ind w:firstLine="5103"/>
         <w:jc w:val="center"/>
         <w:rPr>
           <w:rFonts w:ascii="Bookman Old Style" w:hAnsi="Bookman Old Style"/>
+          <w:sz w:val="20"/>
+          <w:szCs w:val="20"/>
           <w:lang w:val="en-US"/>
         </w:rPr>
       </w:pPr>
       <w:r>
         <w:rPr>
           <w:rFonts w:ascii="Bookman Old Style" w:hAnsi="Bookman Old Style"/>
+          <w:sz w:val="20"/>
+          <w:szCs w:val="20"/>
           <w:lang w:val="en-US"/>
         </w:rPr>
         <w:t>${</w:t>
@@ -1691,6 +1695,8 @@
       <w:r>
         <w:rPr>
           <w:rFonts w:ascii="Bookman Old Style" w:hAnsi="Bookman Old Style"/>
+          <w:sz w:val="20"/>
+          <w:szCs w:val="20"/>
           <w:lang w:val="en-US"/>
         </w:rPr>
         <w:t>DOKTER_PEMERIKSA</w:t>
@@ -1698,6 +1704,8 @@
       <w:r>
         <w:rPr>
           <w:rFonts w:ascii="Bookman Old Style" w:hAnsi="Bookman Old Style"/>
+          <w:sz w:val="20"/>
+          <w:szCs w:val="20"/>
           <w:lang w:val="en-US"/>
         </w:rPr>
         <w:t>}</w:t>

</xml_diff>

<commit_message>
looping table form jpel
</commit_message>
<xml_diff>
--- a/public/doc/input/rehabmedik/cetakFormJadwalPelayanan.docx
+++ b/public/doc/input/rehabmedik/cetakFormJadwalPelayanan.docx
@@ -62,7 +62,6 @@
               </w:rPr>
             </w:pPr>
             <w:proofErr w:type="spellStart"/>
-            <w:proofErr w:type="gramStart"/>
             <w:r>
               <w:rPr>
                 <w:rFonts w:ascii="Bookman Old Style" w:hAnsi="Bookman Old Style"/>
@@ -76,15 +75,7 @@
                 <w:rFonts w:ascii="Bookman Old Style" w:hAnsi="Bookman Old Style"/>
                 <w:lang w:val="en-US"/>
               </w:rPr>
-              <w:t xml:space="preserve"> :</w:t>
-            </w:r>
-            <w:proofErr w:type="gramEnd"/>
-            <w:r>
-              <w:rPr>
-                <w:rFonts w:ascii="Bookman Old Style" w:hAnsi="Bookman Old Style"/>
-                <w:lang w:val="en-US"/>
-              </w:rPr>
-              <w:t xml:space="preserve"> </w:t>
+              <w:t xml:space="preserve"> : </w:t>
             </w:r>
           </w:p>
           <w:p>
@@ -330,7 +321,6 @@
               <w:t xml:space="preserve"> </w:t>
             </w:r>
             <w:proofErr w:type="spellStart"/>
-            <w:proofErr w:type="gramStart"/>
             <w:r>
               <w:rPr>
                 <w:rFonts w:ascii="Bookman Old Style" w:hAnsi="Bookman Old Style"/>
@@ -344,15 +334,7 @@
                 <w:rFonts w:ascii="Bookman Old Style" w:hAnsi="Bookman Old Style"/>
                 <w:lang w:val="en-US"/>
               </w:rPr>
-              <w:t xml:space="preserve"> :</w:t>
-            </w:r>
-            <w:proofErr w:type="gramEnd"/>
-            <w:r>
-              <w:rPr>
-                <w:rFonts w:ascii="Bookman Old Style" w:hAnsi="Bookman Old Style"/>
-                <w:lang w:val="en-US"/>
-              </w:rPr>
-              <w:t xml:space="preserve"> </w:t>
+              <w:t xml:space="preserve"> : </w:t>
             </w:r>
           </w:p>
           <w:p>
@@ -888,678 +870,6 @@
               </w:rPr>
               <w:t>${TTD_TERAPIS2}</w:t>
             </w:r>
-          </w:p>
-        </w:tc>
-      </w:tr>
-      <w:tr>
-        <w:tc>
-          <w:tcPr>
-            <w:tcW w:w="567" w:type="dxa"/>
-            <w:vAlign w:val="center"/>
-          </w:tcPr>
-          <w:p>
-            <w:pPr>
-              <w:spacing w:line="840" w:lineRule="auto"/>
-              <w:jc w:val="center"/>
-              <w:rPr>
-                <w:rFonts w:ascii="Bookman Old Style" w:hAnsi="Bookman Old Style"/>
-                <w:lang w:val="en-US"/>
-              </w:rPr>
-            </w:pPr>
-          </w:p>
-        </w:tc>
-        <w:tc>
-          <w:tcPr>
-            <w:tcW w:w="3261" w:type="dxa"/>
-          </w:tcPr>
-          <w:p>
-            <w:pPr>
-              <w:rPr>
-                <w:rFonts w:ascii="Bookman Old Style" w:hAnsi="Bookman Old Style"/>
-                <w:lang w:val="en-US"/>
-              </w:rPr>
-            </w:pPr>
-          </w:p>
-        </w:tc>
-        <w:tc>
-          <w:tcPr>
-            <w:tcW w:w="1417" w:type="dxa"/>
-          </w:tcPr>
-          <w:p>
-            <w:pPr>
-              <w:rPr>
-                <w:rFonts w:ascii="Bookman Old Style" w:hAnsi="Bookman Old Style"/>
-                <w:lang w:val="en-US"/>
-              </w:rPr>
-            </w:pPr>
-          </w:p>
-        </w:tc>
-        <w:tc>
-          <w:tcPr>
-            <w:tcW w:w="1418" w:type="dxa"/>
-          </w:tcPr>
-          <w:p>
-            <w:pPr>
-              <w:rPr>
-                <w:rFonts w:ascii="Bookman Old Style" w:hAnsi="Bookman Old Style"/>
-                <w:lang w:val="en-US"/>
-              </w:rPr>
-            </w:pPr>
-          </w:p>
-        </w:tc>
-        <w:tc>
-          <w:tcPr>
-            <w:tcW w:w="1417" w:type="dxa"/>
-          </w:tcPr>
-          <w:p>
-            <w:pPr>
-              <w:rPr>
-                <w:rFonts w:ascii="Bookman Old Style" w:hAnsi="Bookman Old Style"/>
-                <w:lang w:val="en-US"/>
-              </w:rPr>
-            </w:pPr>
-          </w:p>
-        </w:tc>
-        <w:tc>
-          <w:tcPr>
-            <w:tcW w:w="1559" w:type="dxa"/>
-          </w:tcPr>
-          <w:p>
-            <w:pPr>
-              <w:rPr>
-                <w:rFonts w:ascii="Bookman Old Style" w:hAnsi="Bookman Old Style"/>
-                <w:lang w:val="en-US"/>
-              </w:rPr>
-            </w:pPr>
-          </w:p>
-        </w:tc>
-        <w:tc>
-          <w:tcPr>
-            <w:tcW w:w="1418" w:type="dxa"/>
-          </w:tcPr>
-          <w:p>
-            <w:pPr>
-              <w:rPr>
-                <w:rFonts w:ascii="Bookman Old Style" w:hAnsi="Bookman Old Style"/>
-                <w:lang w:val="en-US"/>
-              </w:rPr>
-            </w:pPr>
-          </w:p>
-        </w:tc>
-      </w:tr>
-      <w:tr>
-        <w:tc>
-          <w:tcPr>
-            <w:tcW w:w="567" w:type="dxa"/>
-            <w:vAlign w:val="center"/>
-          </w:tcPr>
-          <w:p>
-            <w:pPr>
-              <w:spacing w:line="840" w:lineRule="auto"/>
-              <w:jc w:val="center"/>
-              <w:rPr>
-                <w:rFonts w:ascii="Bookman Old Style" w:hAnsi="Bookman Old Style"/>
-                <w:lang w:val="en-US"/>
-              </w:rPr>
-            </w:pPr>
-          </w:p>
-        </w:tc>
-        <w:tc>
-          <w:tcPr>
-            <w:tcW w:w="3261" w:type="dxa"/>
-          </w:tcPr>
-          <w:p>
-            <w:pPr>
-              <w:rPr>
-                <w:rFonts w:ascii="Bookman Old Style" w:hAnsi="Bookman Old Style"/>
-                <w:lang w:val="en-US"/>
-              </w:rPr>
-            </w:pPr>
-          </w:p>
-        </w:tc>
-        <w:tc>
-          <w:tcPr>
-            <w:tcW w:w="1417" w:type="dxa"/>
-          </w:tcPr>
-          <w:p>
-            <w:pPr>
-              <w:rPr>
-                <w:rFonts w:ascii="Bookman Old Style" w:hAnsi="Bookman Old Style"/>
-                <w:lang w:val="en-US"/>
-              </w:rPr>
-            </w:pPr>
-          </w:p>
-        </w:tc>
-        <w:tc>
-          <w:tcPr>
-            <w:tcW w:w="1418" w:type="dxa"/>
-          </w:tcPr>
-          <w:p>
-            <w:pPr>
-              <w:rPr>
-                <w:rFonts w:ascii="Bookman Old Style" w:hAnsi="Bookman Old Style"/>
-                <w:lang w:val="en-US"/>
-              </w:rPr>
-            </w:pPr>
-          </w:p>
-        </w:tc>
-        <w:tc>
-          <w:tcPr>
-            <w:tcW w:w="1417" w:type="dxa"/>
-          </w:tcPr>
-          <w:p>
-            <w:pPr>
-              <w:rPr>
-                <w:rFonts w:ascii="Bookman Old Style" w:hAnsi="Bookman Old Style"/>
-                <w:lang w:val="en-US"/>
-              </w:rPr>
-            </w:pPr>
-          </w:p>
-        </w:tc>
-        <w:tc>
-          <w:tcPr>
-            <w:tcW w:w="1559" w:type="dxa"/>
-          </w:tcPr>
-          <w:p>
-            <w:pPr>
-              <w:rPr>
-                <w:rFonts w:ascii="Bookman Old Style" w:hAnsi="Bookman Old Style"/>
-                <w:lang w:val="en-US"/>
-              </w:rPr>
-            </w:pPr>
-          </w:p>
-        </w:tc>
-        <w:tc>
-          <w:tcPr>
-            <w:tcW w:w="1418" w:type="dxa"/>
-          </w:tcPr>
-          <w:p>
-            <w:pPr>
-              <w:rPr>
-                <w:rFonts w:ascii="Bookman Old Style" w:hAnsi="Bookman Old Style"/>
-                <w:lang w:val="en-US"/>
-              </w:rPr>
-            </w:pPr>
-          </w:p>
-        </w:tc>
-      </w:tr>
-      <w:tr>
-        <w:tc>
-          <w:tcPr>
-            <w:tcW w:w="567" w:type="dxa"/>
-            <w:vAlign w:val="center"/>
-          </w:tcPr>
-          <w:p>
-            <w:pPr>
-              <w:spacing w:line="840" w:lineRule="auto"/>
-              <w:jc w:val="center"/>
-              <w:rPr>
-                <w:rFonts w:ascii="Bookman Old Style" w:hAnsi="Bookman Old Style"/>
-                <w:lang w:val="en-US"/>
-              </w:rPr>
-            </w:pPr>
-          </w:p>
-        </w:tc>
-        <w:tc>
-          <w:tcPr>
-            <w:tcW w:w="3261" w:type="dxa"/>
-          </w:tcPr>
-          <w:p>
-            <w:pPr>
-              <w:rPr>
-                <w:rFonts w:ascii="Bookman Old Style" w:hAnsi="Bookman Old Style"/>
-                <w:lang w:val="en-US"/>
-              </w:rPr>
-            </w:pPr>
-          </w:p>
-        </w:tc>
-        <w:tc>
-          <w:tcPr>
-            <w:tcW w:w="1417" w:type="dxa"/>
-          </w:tcPr>
-          <w:p>
-            <w:pPr>
-              <w:rPr>
-                <w:rFonts w:ascii="Bookman Old Style" w:hAnsi="Bookman Old Style"/>
-                <w:lang w:val="en-US"/>
-              </w:rPr>
-            </w:pPr>
-          </w:p>
-        </w:tc>
-        <w:tc>
-          <w:tcPr>
-            <w:tcW w:w="1418" w:type="dxa"/>
-          </w:tcPr>
-          <w:p>
-            <w:pPr>
-              <w:rPr>
-                <w:rFonts w:ascii="Bookman Old Style" w:hAnsi="Bookman Old Style"/>
-                <w:lang w:val="en-US"/>
-              </w:rPr>
-            </w:pPr>
-          </w:p>
-        </w:tc>
-        <w:tc>
-          <w:tcPr>
-            <w:tcW w:w="1417" w:type="dxa"/>
-          </w:tcPr>
-          <w:p>
-            <w:pPr>
-              <w:rPr>
-                <w:rFonts w:ascii="Bookman Old Style" w:hAnsi="Bookman Old Style"/>
-                <w:lang w:val="en-US"/>
-              </w:rPr>
-            </w:pPr>
-          </w:p>
-        </w:tc>
-        <w:tc>
-          <w:tcPr>
-            <w:tcW w:w="1559" w:type="dxa"/>
-          </w:tcPr>
-          <w:p>
-            <w:pPr>
-              <w:rPr>
-                <w:rFonts w:ascii="Bookman Old Style" w:hAnsi="Bookman Old Style"/>
-                <w:lang w:val="en-US"/>
-              </w:rPr>
-            </w:pPr>
-          </w:p>
-        </w:tc>
-        <w:tc>
-          <w:tcPr>
-            <w:tcW w:w="1418" w:type="dxa"/>
-          </w:tcPr>
-          <w:p>
-            <w:pPr>
-              <w:rPr>
-                <w:rFonts w:ascii="Bookman Old Style" w:hAnsi="Bookman Old Style"/>
-                <w:lang w:val="en-US"/>
-              </w:rPr>
-            </w:pPr>
-          </w:p>
-        </w:tc>
-      </w:tr>
-      <w:tr>
-        <w:tc>
-          <w:tcPr>
-            <w:tcW w:w="567" w:type="dxa"/>
-            <w:vAlign w:val="center"/>
-          </w:tcPr>
-          <w:p>
-            <w:pPr>
-              <w:spacing w:line="840" w:lineRule="auto"/>
-              <w:jc w:val="center"/>
-              <w:rPr>
-                <w:rFonts w:ascii="Bookman Old Style" w:hAnsi="Bookman Old Style"/>
-                <w:lang w:val="en-US"/>
-              </w:rPr>
-            </w:pPr>
-          </w:p>
-        </w:tc>
-        <w:tc>
-          <w:tcPr>
-            <w:tcW w:w="3261" w:type="dxa"/>
-          </w:tcPr>
-          <w:p>
-            <w:pPr>
-              <w:rPr>
-                <w:rFonts w:ascii="Bookman Old Style" w:hAnsi="Bookman Old Style"/>
-                <w:lang w:val="en-US"/>
-              </w:rPr>
-            </w:pPr>
-          </w:p>
-        </w:tc>
-        <w:tc>
-          <w:tcPr>
-            <w:tcW w:w="1417" w:type="dxa"/>
-          </w:tcPr>
-          <w:p>
-            <w:pPr>
-              <w:rPr>
-                <w:rFonts w:ascii="Bookman Old Style" w:hAnsi="Bookman Old Style"/>
-                <w:lang w:val="en-US"/>
-              </w:rPr>
-            </w:pPr>
-          </w:p>
-        </w:tc>
-        <w:tc>
-          <w:tcPr>
-            <w:tcW w:w="1418" w:type="dxa"/>
-          </w:tcPr>
-          <w:p>
-            <w:pPr>
-              <w:rPr>
-                <w:rFonts w:ascii="Bookman Old Style" w:hAnsi="Bookman Old Style"/>
-                <w:lang w:val="en-US"/>
-              </w:rPr>
-            </w:pPr>
-          </w:p>
-        </w:tc>
-        <w:tc>
-          <w:tcPr>
-            <w:tcW w:w="1417" w:type="dxa"/>
-          </w:tcPr>
-          <w:p>
-            <w:pPr>
-              <w:rPr>
-                <w:rFonts w:ascii="Bookman Old Style" w:hAnsi="Bookman Old Style"/>
-                <w:lang w:val="en-US"/>
-              </w:rPr>
-            </w:pPr>
-          </w:p>
-        </w:tc>
-        <w:tc>
-          <w:tcPr>
-            <w:tcW w:w="1559" w:type="dxa"/>
-          </w:tcPr>
-          <w:p>
-            <w:pPr>
-              <w:rPr>
-                <w:rFonts w:ascii="Bookman Old Style" w:hAnsi="Bookman Old Style"/>
-                <w:lang w:val="en-US"/>
-              </w:rPr>
-            </w:pPr>
-          </w:p>
-        </w:tc>
-        <w:tc>
-          <w:tcPr>
-            <w:tcW w:w="1418" w:type="dxa"/>
-          </w:tcPr>
-          <w:p>
-            <w:pPr>
-              <w:rPr>
-                <w:rFonts w:ascii="Bookman Old Style" w:hAnsi="Bookman Old Style"/>
-                <w:lang w:val="en-US"/>
-              </w:rPr>
-            </w:pPr>
-          </w:p>
-        </w:tc>
-      </w:tr>
-      <w:tr>
-        <w:tc>
-          <w:tcPr>
-            <w:tcW w:w="567" w:type="dxa"/>
-            <w:vAlign w:val="center"/>
-          </w:tcPr>
-          <w:p>
-            <w:pPr>
-              <w:spacing w:line="840" w:lineRule="auto"/>
-              <w:jc w:val="center"/>
-              <w:rPr>
-                <w:rFonts w:ascii="Bookman Old Style" w:hAnsi="Bookman Old Style"/>
-                <w:lang w:val="en-US"/>
-              </w:rPr>
-            </w:pPr>
-          </w:p>
-        </w:tc>
-        <w:tc>
-          <w:tcPr>
-            <w:tcW w:w="3261" w:type="dxa"/>
-          </w:tcPr>
-          <w:p>
-            <w:pPr>
-              <w:rPr>
-                <w:rFonts w:ascii="Bookman Old Style" w:hAnsi="Bookman Old Style"/>
-                <w:lang w:val="en-US"/>
-              </w:rPr>
-            </w:pPr>
-          </w:p>
-        </w:tc>
-        <w:tc>
-          <w:tcPr>
-            <w:tcW w:w="1417" w:type="dxa"/>
-          </w:tcPr>
-          <w:p>
-            <w:pPr>
-              <w:rPr>
-                <w:rFonts w:ascii="Bookman Old Style" w:hAnsi="Bookman Old Style"/>
-                <w:lang w:val="en-US"/>
-              </w:rPr>
-            </w:pPr>
-          </w:p>
-        </w:tc>
-        <w:tc>
-          <w:tcPr>
-            <w:tcW w:w="1418" w:type="dxa"/>
-          </w:tcPr>
-          <w:p>
-            <w:pPr>
-              <w:rPr>
-                <w:rFonts w:ascii="Bookman Old Style" w:hAnsi="Bookman Old Style"/>
-                <w:lang w:val="en-US"/>
-              </w:rPr>
-            </w:pPr>
-          </w:p>
-        </w:tc>
-        <w:tc>
-          <w:tcPr>
-            <w:tcW w:w="1417" w:type="dxa"/>
-          </w:tcPr>
-          <w:p>
-            <w:pPr>
-              <w:rPr>
-                <w:rFonts w:ascii="Bookman Old Style" w:hAnsi="Bookman Old Style"/>
-                <w:lang w:val="en-US"/>
-              </w:rPr>
-            </w:pPr>
-          </w:p>
-        </w:tc>
-        <w:tc>
-          <w:tcPr>
-            <w:tcW w:w="1559" w:type="dxa"/>
-          </w:tcPr>
-          <w:p>
-            <w:pPr>
-              <w:rPr>
-                <w:rFonts w:ascii="Bookman Old Style" w:hAnsi="Bookman Old Style"/>
-                <w:lang w:val="en-US"/>
-              </w:rPr>
-            </w:pPr>
-          </w:p>
-        </w:tc>
-        <w:tc>
-          <w:tcPr>
-            <w:tcW w:w="1418" w:type="dxa"/>
-          </w:tcPr>
-          <w:p>
-            <w:pPr>
-              <w:rPr>
-                <w:rFonts w:ascii="Bookman Old Style" w:hAnsi="Bookman Old Style"/>
-                <w:lang w:val="en-US"/>
-              </w:rPr>
-            </w:pPr>
-          </w:p>
-        </w:tc>
-      </w:tr>
-      <w:tr>
-        <w:tc>
-          <w:tcPr>
-            <w:tcW w:w="567" w:type="dxa"/>
-            <w:vAlign w:val="center"/>
-          </w:tcPr>
-          <w:p>
-            <w:pPr>
-              <w:spacing w:line="840" w:lineRule="auto"/>
-              <w:jc w:val="center"/>
-              <w:rPr>
-                <w:rFonts w:ascii="Bookman Old Style" w:hAnsi="Bookman Old Style"/>
-                <w:lang w:val="en-US"/>
-              </w:rPr>
-            </w:pPr>
-          </w:p>
-        </w:tc>
-        <w:tc>
-          <w:tcPr>
-            <w:tcW w:w="3261" w:type="dxa"/>
-          </w:tcPr>
-          <w:p>
-            <w:pPr>
-              <w:rPr>
-                <w:rFonts w:ascii="Bookman Old Style" w:hAnsi="Bookman Old Style"/>
-                <w:lang w:val="en-US"/>
-              </w:rPr>
-            </w:pPr>
-          </w:p>
-        </w:tc>
-        <w:tc>
-          <w:tcPr>
-            <w:tcW w:w="1417" w:type="dxa"/>
-          </w:tcPr>
-          <w:p>
-            <w:pPr>
-              <w:rPr>
-                <w:rFonts w:ascii="Bookman Old Style" w:hAnsi="Bookman Old Style"/>
-                <w:lang w:val="en-US"/>
-              </w:rPr>
-            </w:pPr>
-          </w:p>
-        </w:tc>
-        <w:tc>
-          <w:tcPr>
-            <w:tcW w:w="1418" w:type="dxa"/>
-          </w:tcPr>
-          <w:p>
-            <w:pPr>
-              <w:rPr>
-                <w:rFonts w:ascii="Bookman Old Style" w:hAnsi="Bookman Old Style"/>
-                <w:lang w:val="en-US"/>
-              </w:rPr>
-            </w:pPr>
-          </w:p>
-        </w:tc>
-        <w:tc>
-          <w:tcPr>
-            <w:tcW w:w="1417" w:type="dxa"/>
-          </w:tcPr>
-          <w:p>
-            <w:pPr>
-              <w:rPr>
-                <w:rFonts w:ascii="Bookman Old Style" w:hAnsi="Bookman Old Style"/>
-                <w:lang w:val="en-US"/>
-              </w:rPr>
-            </w:pPr>
-          </w:p>
-        </w:tc>
-        <w:tc>
-          <w:tcPr>
-            <w:tcW w:w="1559" w:type="dxa"/>
-          </w:tcPr>
-          <w:p>
-            <w:pPr>
-              <w:rPr>
-                <w:rFonts w:ascii="Bookman Old Style" w:hAnsi="Bookman Old Style"/>
-                <w:lang w:val="en-US"/>
-              </w:rPr>
-            </w:pPr>
-          </w:p>
-        </w:tc>
-        <w:tc>
-          <w:tcPr>
-            <w:tcW w:w="1418" w:type="dxa"/>
-          </w:tcPr>
-          <w:p>
-            <w:pPr>
-              <w:rPr>
-                <w:rFonts w:ascii="Bookman Old Style" w:hAnsi="Bookman Old Style"/>
-                <w:lang w:val="en-US"/>
-              </w:rPr>
-            </w:pPr>
-          </w:p>
-        </w:tc>
-      </w:tr>
-      <w:tr>
-        <w:tc>
-          <w:tcPr>
-            <w:tcW w:w="567" w:type="dxa"/>
-            <w:vAlign w:val="center"/>
-          </w:tcPr>
-          <w:p>
-            <w:pPr>
-              <w:spacing w:line="840" w:lineRule="auto"/>
-              <w:jc w:val="center"/>
-              <w:rPr>
-                <w:rFonts w:ascii="Bookman Old Style" w:hAnsi="Bookman Old Style"/>
-                <w:lang w:val="en-US"/>
-              </w:rPr>
-            </w:pPr>
-          </w:p>
-        </w:tc>
-        <w:tc>
-          <w:tcPr>
-            <w:tcW w:w="3261" w:type="dxa"/>
-          </w:tcPr>
-          <w:p>
-            <w:pPr>
-              <w:rPr>
-                <w:rFonts w:ascii="Bookman Old Style" w:hAnsi="Bookman Old Style"/>
-                <w:lang w:val="en-US"/>
-              </w:rPr>
-            </w:pPr>
-          </w:p>
-        </w:tc>
-        <w:tc>
-          <w:tcPr>
-            <w:tcW w:w="1417" w:type="dxa"/>
-          </w:tcPr>
-          <w:p>
-            <w:pPr>
-              <w:rPr>
-                <w:rFonts w:ascii="Bookman Old Style" w:hAnsi="Bookman Old Style"/>
-                <w:lang w:val="en-US"/>
-              </w:rPr>
-            </w:pPr>
-          </w:p>
-        </w:tc>
-        <w:tc>
-          <w:tcPr>
-            <w:tcW w:w="1418" w:type="dxa"/>
-          </w:tcPr>
-          <w:p>
-            <w:pPr>
-              <w:rPr>
-                <w:rFonts w:ascii="Bookman Old Style" w:hAnsi="Bookman Old Style"/>
-                <w:lang w:val="en-US"/>
-              </w:rPr>
-            </w:pPr>
-          </w:p>
-        </w:tc>
-        <w:tc>
-          <w:tcPr>
-            <w:tcW w:w="1417" w:type="dxa"/>
-          </w:tcPr>
-          <w:p>
-            <w:pPr>
-              <w:rPr>
-                <w:rFonts w:ascii="Bookman Old Style" w:hAnsi="Bookman Old Style"/>
-                <w:lang w:val="en-US"/>
-              </w:rPr>
-            </w:pPr>
-          </w:p>
-        </w:tc>
-        <w:tc>
-          <w:tcPr>
-            <w:tcW w:w="1559" w:type="dxa"/>
-          </w:tcPr>
-          <w:p>
-            <w:pPr>
-              <w:rPr>
-                <w:rFonts w:ascii="Bookman Old Style" w:hAnsi="Bookman Old Style"/>
-                <w:lang w:val="en-US"/>
-              </w:rPr>
-            </w:pPr>
-          </w:p>
-        </w:tc>
-        <w:tc>
-          <w:tcPr>
-            <w:tcW w:w="1418" w:type="dxa"/>
-          </w:tcPr>
-          <w:p>
-            <w:pPr>
-              <w:rPr>
-                <w:rFonts w:ascii="Bookman Old Style" w:hAnsi="Bookman Old Style"/>
-                <w:lang w:val="en-US"/>
-              </w:rPr>
-            </w:pPr>
           </w:p>
         </w:tc>
       </w:tr>

</xml_diff>